<commit_message>
Set principal office to 13387 Hwy 69 N, Tyler TX in Company Profile
User confirmed the agency's operating office. Note: the 700 N Main St, Lindale
address remains in the Hickory review memo as the MIPA legal notice address (a
separate, factual record) - only the operating office is updated here.

https://claude.ai/code/session_01GAHLyfqLR9bxwN2jm6VjPU
</commit_message>
<xml_diff>
--- a/sba_application/01_company_profile/Company_Profile_DRAFT.docx
+++ b/sba_application/01_company_profile/Company_Profile_DRAFT.docx
@@ -128,7 +128,7 @@
         <w:t xml:space="preserve">Address:  </w:t>
       </w:r>
       <w:r>
-        <w:t>700 N Main Street, Lindale, TX 75771 (principal office / notice address)</w:t>
+        <w:t>13387 Hwy 69 N, Tyler, TX (principal office)</w:t>
       </w:r>
     </w:p>
     <w:p>
@@ -139,7 +139,7 @@
         <w:t xml:space="preserve">City / County / State / Zip:  </w:t>
       </w:r>
       <w:r>
-        <w:t>Lindale / Smith / TX / 75771</w:t>
+        <w:t>Tyler / Smith / TX / __________ (to provide) (zip)</w:t>
       </w:r>
     </w:p>
     <w:p>

</xml_diff>